<commit_message>
UP file 2609106012_Isna Daiyan Fatkiyah_POSTTEST2_A1'26.docx
</commit_message>
<xml_diff>
--- a/POSTTEST/posttest-apd-2/2609106012_Isna Daiyan Fatkiyah_POSTTEST2_A1'26.docx
+++ b/POSTTEST/posttest-apd-2/2609106012_Isna Daiyan Fatkiyah_POSTTEST2_A1'26.docx
@@ -153,7 +153,7 @@
           <w:sz w:val="20"/>
         </w:rPr>
         <w:drawing>
-          <wp:anchor distT="0" distB="0" distL="0" distR="0" simplePos="0" relativeHeight="487587840" behindDoc="1" locked="0" layoutInCell="1" allowOverlap="1" wp14:anchorId="5F55E3DA" wp14:editId="0C36522F">
+          <wp:anchor distT="0" distB="0" distL="0" distR="0" simplePos="0" relativeHeight="251658240" behindDoc="1" locked="0" layoutInCell="1" allowOverlap="1" wp14:anchorId="5F55E3DA" wp14:editId="0C36522F">
             <wp:simplePos x="0" y="0"/>
             <wp:positionH relativeFrom="page">
               <wp:posOffset>2324100</wp:posOffset>
@@ -479,7 +479,6 @@
         <w:rPr>
           <w:spacing w:val="-2"/>
         </w:rPr>
-        <w:lastRenderedPageBreak/>
         <w:t>Flowchart</w:t>
       </w:r>
     </w:p>
@@ -586,7 +585,6 @@
           <w:sz w:val="24"/>
           <w:szCs w:val="24"/>
         </w:rPr>
-        <w:lastRenderedPageBreak/>
         <w:t>S</w:t>
       </w:r>
       <w:r>
@@ -1056,7 +1054,6 @@
         <w:spacing w:line="360" w:lineRule="auto"/>
       </w:pPr>
       <w:r>
-        <w:lastRenderedPageBreak/>
         <w:t xml:space="preserve">Source Code </w:t>
       </w:r>
     </w:p>
@@ -1139,63 +1136,195 @@
         <w:t>Source Code:</w:t>
       </w:r>
     </w:p>
-    <w:p>
-      <w:pPr>
-        <w:pStyle w:val="ListParagraph"/>
-        <w:spacing w:line="360" w:lineRule="auto"/>
-        <w:ind w:left="567" w:firstLine="0"/>
-        <w:jc w:val="both"/>
-        <w:rPr>
-          <w:b/>
-          <w:bCs/>
-          <w:sz w:val="24"/>
-          <w:szCs w:val="24"/>
-        </w:rPr>
-      </w:pPr>
-      <w:r>
-        <w:rPr>
-          <w:b/>
-          <w:bCs/>
-          <w:sz w:val="24"/>
-          <w:szCs w:val="24"/>
-        </w:rPr>
-        <w:drawing>
-          <wp:inline distT="0" distB="0" distL="0" distR="0" wp14:anchorId="532339ED" wp14:editId="09720F7E">
-            <wp:extent cx="4407126" cy="1244664"/>
-            <wp:effectExtent l="0" t="0" r="0" b="0"/>
-            <wp:docPr id="102034044" name="Picture 1"/>
-            <wp:cNvGraphicFramePr>
-              <a:graphicFrameLocks xmlns:a="http://schemas.openxmlformats.org/drawingml/2006/main" noChangeAspect="1"/>
-            </wp:cNvGraphicFramePr>
-            <a:graphic xmlns:a="http://schemas.openxmlformats.org/drawingml/2006/main">
-              <a:graphicData uri="http://schemas.openxmlformats.org/drawingml/2006/picture">
-                <pic:pic xmlns:pic="http://schemas.openxmlformats.org/drawingml/2006/picture">
-                  <pic:nvPicPr>
-                    <pic:cNvPr id="102034044" name=""/>
-                    <pic:cNvPicPr/>
-                  </pic:nvPicPr>
-                  <pic:blipFill>
-                    <a:blip r:embed="rId9"/>
-                    <a:stretch>
-                      <a:fillRect/>
-                    </a:stretch>
-                  </pic:blipFill>
-                  <pic:spPr>
-                    <a:xfrm>
-                      <a:off x="0" y="0"/>
-                      <a:ext cx="4407126" cy="1244664"/>
-                    </a:xfrm>
-                    <a:prstGeom prst="rect">
-                      <a:avLst/>
-                    </a:prstGeom>
-                  </pic:spPr>
-                </pic:pic>
-              </a:graphicData>
-            </a:graphic>
-          </wp:inline>
-        </w:drawing>
-      </w:r>
-    </w:p>
+    <w:tbl>
+      <w:tblPr>
+        <w:tblW w:w="9015" w:type="dxa"/>
+        <w:tblInd w:w="667" w:type="dxa"/>
+        <w:tblLayout w:type="fixed"/>
+        <w:tblLook w:val="0600" w:firstRow="0" w:lastRow="0" w:firstColumn="0" w:lastColumn="0" w:noHBand="1" w:noVBand="1"/>
+      </w:tblPr>
+      <w:tblGrid>
+        <w:gridCol w:w="9015"/>
+      </w:tblGrid>
+      <w:tr>
+        <w:tc>
+          <w:tcPr>
+            <w:tcW w:w="9015" w:type="dxa"/>
+            <w:shd w:val="clear" w:color="auto" w:fill="282C34"/>
+            <w:tcMar>
+              <w:top w:w="100" w:type="dxa"/>
+              <w:left w:w="100" w:type="dxa"/>
+              <w:bottom w:w="100" w:type="dxa"/>
+              <w:right w:w="100" w:type="dxa"/>
+            </w:tcMar>
+          </w:tcPr>
+          <w:p>
+            <w:pPr>
+              <w:pBdr>
+                <w:top w:val="nil"/>
+                <w:left w:val="nil"/>
+                <w:bottom w:val="nil"/>
+                <w:right w:val="nil"/>
+                <w:between w:val="nil"/>
+              </w:pBdr>
+              <w:spacing w:line="360" w:lineRule="auto"/>
+              <w:rPr>
+                <w:rFonts w:ascii="Courier New" w:eastAsia="Courier New" w:hAnsi="Courier New" w:cs="Courier New"/>
+                <w:color w:val="B5CEA8"/>
+                <w:sz w:val="20"/>
+                <w:szCs w:val="20"/>
+              </w:rPr>
+            </w:pPr>
+            <w:r>
+              <w:rPr>
+                <w:rFonts w:ascii="Consolas" w:eastAsia="Consolas" w:hAnsi="Consolas" w:cs="Consolas"/>
+                <w:color w:val="ABB2BF"/>
+                <w:sz w:val="20"/>
+                <w:szCs w:val="20"/>
+                <w:shd w:val="clear" w:color="auto" w:fill="282C34"/>
+              </w:rPr>
+              <w:t xml:space="preserve">Barang_1 = </w:t>
+            </w:r>
+            <w:r>
+              <w:rPr>
+                <w:rFonts w:ascii="Consolas" w:eastAsia="Consolas" w:hAnsi="Consolas" w:cs="Consolas"/>
+                <w:color w:val="D19A66"/>
+                <w:sz w:val="20"/>
+                <w:szCs w:val="20"/>
+                <w:shd w:val="clear" w:color="auto" w:fill="282C34"/>
+              </w:rPr>
+              <w:t>15000</w:t>
+            </w:r>
+            <w:r>
+              <w:rPr>
+                <w:rFonts w:ascii="Consolas" w:eastAsia="Consolas" w:hAnsi="Consolas" w:cs="Consolas"/>
+                <w:color w:val="ABB2BF"/>
+                <w:sz w:val="20"/>
+                <w:szCs w:val="20"/>
+                <w:shd w:val="clear" w:color="auto" w:fill="282C34"/>
+              </w:rPr>
+              <w:br/>
+              <w:t xml:space="preserve">Barang_2 = </w:t>
+            </w:r>
+            <w:r>
+              <w:rPr>
+                <w:rFonts w:ascii="Consolas" w:eastAsia="Consolas" w:hAnsi="Consolas" w:cs="Consolas"/>
+                <w:color w:val="D19A66"/>
+                <w:sz w:val="20"/>
+                <w:szCs w:val="20"/>
+                <w:shd w:val="clear" w:color="auto" w:fill="282C34"/>
+              </w:rPr>
+              <w:t>25000</w:t>
+            </w:r>
+            <w:r>
+              <w:rPr>
+                <w:rFonts w:ascii="Consolas" w:eastAsia="Consolas" w:hAnsi="Consolas" w:cs="Consolas"/>
+                <w:color w:val="ABB2BF"/>
+                <w:sz w:val="20"/>
+                <w:szCs w:val="20"/>
+                <w:shd w:val="clear" w:color="auto" w:fill="282C34"/>
+              </w:rPr>
+              <w:br/>
+              <w:t xml:space="preserve">Barang_3 = </w:t>
+            </w:r>
+            <w:r>
+              <w:rPr>
+                <w:rFonts w:ascii="Consolas" w:eastAsia="Consolas" w:hAnsi="Consolas" w:cs="Consolas"/>
+                <w:color w:val="D19A66"/>
+                <w:sz w:val="20"/>
+                <w:szCs w:val="20"/>
+                <w:shd w:val="clear" w:color="auto" w:fill="282C34"/>
+              </w:rPr>
+              <w:t>10000</w:t>
+            </w:r>
+            <w:r>
+              <w:rPr>
+                <w:rFonts w:ascii="Consolas" w:eastAsia="Consolas" w:hAnsi="Consolas" w:cs="Consolas"/>
+                <w:color w:val="ABB2BF"/>
+                <w:sz w:val="20"/>
+                <w:szCs w:val="20"/>
+                <w:shd w:val="clear" w:color="auto" w:fill="282C34"/>
+              </w:rPr>
+              <w:br/>
+              <w:t xml:space="preserve">Barang_4 = </w:t>
+            </w:r>
+            <w:r>
+              <w:rPr>
+                <w:rFonts w:ascii="Consolas" w:eastAsia="Consolas" w:hAnsi="Consolas" w:cs="Consolas"/>
+                <w:color w:val="D19A66"/>
+                <w:sz w:val="20"/>
+                <w:szCs w:val="20"/>
+                <w:shd w:val="clear" w:color="auto" w:fill="282C34"/>
+              </w:rPr>
+              <w:t>5500</w:t>
+            </w:r>
+            <w:r>
+              <w:rPr>
+                <w:rFonts w:ascii="Consolas" w:eastAsia="Consolas" w:hAnsi="Consolas" w:cs="Consolas"/>
+                <w:color w:val="ABB2BF"/>
+                <w:sz w:val="20"/>
+                <w:szCs w:val="20"/>
+                <w:shd w:val="clear" w:color="auto" w:fill="282C34"/>
+              </w:rPr>
+              <w:br/>
+              <w:t xml:space="preserve">Barang_5 = </w:t>
+            </w:r>
+            <w:r>
+              <w:rPr>
+                <w:rFonts w:ascii="Consolas" w:eastAsia="Consolas" w:hAnsi="Consolas" w:cs="Consolas"/>
+                <w:color w:val="D19A66"/>
+                <w:sz w:val="20"/>
+                <w:szCs w:val="20"/>
+                <w:shd w:val="clear" w:color="auto" w:fill="282C34"/>
+              </w:rPr>
+              <w:t>5000</w:t>
+            </w:r>
+            <w:r>
+              <w:rPr>
+                <w:rFonts w:ascii="Consolas" w:eastAsia="Consolas" w:hAnsi="Consolas" w:cs="Consolas"/>
+                <w:color w:val="ABB2BF"/>
+                <w:sz w:val="20"/>
+                <w:szCs w:val="20"/>
+                <w:shd w:val="clear" w:color="auto" w:fill="282C34"/>
+              </w:rPr>
+              <w:br/>
+              <w:t xml:space="preserve">Barang_6 = </w:t>
+            </w:r>
+            <w:r>
+              <w:rPr>
+                <w:rFonts w:ascii="Consolas" w:eastAsia="Consolas" w:hAnsi="Consolas" w:cs="Consolas"/>
+                <w:color w:val="D19A66"/>
+                <w:sz w:val="20"/>
+                <w:szCs w:val="20"/>
+                <w:shd w:val="clear" w:color="auto" w:fill="282C34"/>
+              </w:rPr>
+              <w:t>20000</w:t>
+            </w:r>
+            <w:r>
+              <w:rPr>
+                <w:rFonts w:ascii="Consolas" w:eastAsia="Consolas" w:hAnsi="Consolas" w:cs="Consolas"/>
+                <w:color w:val="ABB2BF"/>
+                <w:sz w:val="20"/>
+                <w:szCs w:val="20"/>
+                <w:shd w:val="clear" w:color="auto" w:fill="282C34"/>
+              </w:rPr>
+              <w:br/>
+              <w:t xml:space="preserve">NIM = </w:t>
+            </w:r>
+            <w:r>
+              <w:rPr>
+                <w:rFonts w:ascii="Consolas" w:eastAsia="Consolas" w:hAnsi="Consolas" w:cs="Consolas"/>
+                <w:color w:val="D19A66"/>
+                <w:sz w:val="20"/>
+                <w:szCs w:val="20"/>
+                <w:shd w:val="clear" w:color="auto" w:fill="282C34"/>
+              </w:rPr>
+              <w:t>12</w:t>
+            </w:r>
+          </w:p>
+        </w:tc>
+      </w:tr>
+    </w:tbl>
     <w:p>
       <w:pPr>
         <w:pStyle w:val="ListParagraph"/>
@@ -1275,63 +1404,59 @@
         <w:t>Source Code:</w:t>
       </w:r>
     </w:p>
-    <w:p>
-      <w:pPr>
-        <w:pStyle w:val="ListParagraph"/>
-        <w:spacing w:line="360" w:lineRule="auto"/>
-        <w:ind w:left="567" w:firstLine="0"/>
-        <w:jc w:val="both"/>
-        <w:rPr>
-          <w:b/>
-          <w:bCs/>
-          <w:sz w:val="24"/>
-          <w:szCs w:val="24"/>
-        </w:rPr>
-      </w:pPr>
-      <w:r>
-        <w:rPr>
-          <w:b/>
-          <w:bCs/>
-          <w:sz w:val="24"/>
-          <w:szCs w:val="24"/>
-        </w:rPr>
-        <w:drawing>
-          <wp:inline distT="0" distB="0" distL="0" distR="0" wp14:anchorId="54E7AFA6" wp14:editId="6E47E45C">
-            <wp:extent cx="5769610" cy="151130"/>
-            <wp:effectExtent l="0" t="0" r="2540" b="1270"/>
-            <wp:docPr id="2012054669" name="Picture 1"/>
-            <wp:cNvGraphicFramePr>
-              <a:graphicFrameLocks xmlns:a="http://schemas.openxmlformats.org/drawingml/2006/main" noChangeAspect="1"/>
-            </wp:cNvGraphicFramePr>
-            <a:graphic xmlns:a="http://schemas.openxmlformats.org/drawingml/2006/main">
-              <a:graphicData uri="http://schemas.openxmlformats.org/drawingml/2006/picture">
-                <pic:pic xmlns:pic="http://schemas.openxmlformats.org/drawingml/2006/picture">
-                  <pic:nvPicPr>
-                    <pic:cNvPr id="2012054669" name=""/>
-                    <pic:cNvPicPr/>
-                  </pic:nvPicPr>
-                  <pic:blipFill>
-                    <a:blip r:embed="rId10"/>
-                    <a:stretch>
-                      <a:fillRect/>
-                    </a:stretch>
-                  </pic:blipFill>
-                  <pic:spPr>
-                    <a:xfrm>
-                      <a:off x="0" y="0"/>
-                      <a:ext cx="5769610" cy="151130"/>
-                    </a:xfrm>
-                    <a:prstGeom prst="rect">
-                      <a:avLst/>
-                    </a:prstGeom>
-                  </pic:spPr>
-                </pic:pic>
-              </a:graphicData>
-            </a:graphic>
-          </wp:inline>
-        </w:drawing>
-      </w:r>
-    </w:p>
+    <w:tbl>
+      <w:tblPr>
+        <w:tblW w:w="9015" w:type="dxa"/>
+        <w:tblInd w:w="667" w:type="dxa"/>
+        <w:tblLayout w:type="fixed"/>
+        <w:tblLook w:val="0600" w:firstRow="0" w:lastRow="0" w:firstColumn="0" w:lastColumn="0" w:noHBand="1" w:noVBand="1"/>
+      </w:tblPr>
+      <w:tblGrid>
+        <w:gridCol w:w="9015"/>
+      </w:tblGrid>
+      <w:tr>
+        <w:tc>
+          <w:tcPr>
+            <w:tcW w:w="9015" w:type="dxa"/>
+            <w:shd w:val="clear" w:color="auto" w:fill="282C34"/>
+            <w:tcMar>
+              <w:top w:w="100" w:type="dxa"/>
+              <w:left w:w="100" w:type="dxa"/>
+              <w:bottom w:w="100" w:type="dxa"/>
+              <w:right w:w="100" w:type="dxa"/>
+            </w:tcMar>
+          </w:tcPr>
+          <w:p>
+            <w:pPr>
+              <w:pBdr>
+                <w:top w:val="nil"/>
+                <w:left w:val="nil"/>
+                <w:bottom w:val="nil"/>
+                <w:right w:val="nil"/>
+                <w:between w:val="nil"/>
+              </w:pBdr>
+              <w:spacing w:line="360" w:lineRule="auto"/>
+              <w:rPr>
+                <w:rFonts w:ascii="Consolas" w:eastAsia="Consolas" w:hAnsi="Consolas" w:cs="Consolas"/>
+                <w:color w:val="BBBEBF"/>
+                <w:sz w:val="20"/>
+                <w:szCs w:val="20"/>
+              </w:rPr>
+            </w:pPr>
+            <w:r>
+              <w:rPr>
+                <w:rFonts w:ascii="Consolas" w:eastAsia="Consolas" w:hAnsi="Consolas" w:cs="Consolas"/>
+                <w:color w:val="ABB2BF"/>
+                <w:sz w:val="20"/>
+                <w:szCs w:val="20"/>
+                <w:shd w:val="clear" w:color="auto" w:fill="282C34"/>
+              </w:rPr>
+              <w:t>Barang = [Barang_1, Barang_2, Barang_3, Barang_4, Barang_5, Barang_6]</w:t>
+            </w:r>
+          </w:p>
+        </w:tc>
+      </w:tr>
+    </w:tbl>
     <w:p>
       <w:pPr>
         <w:pStyle w:val="ListParagraph"/>
@@ -1411,63 +1536,109 @@
         <w:t>Source Code:</w:t>
       </w:r>
     </w:p>
-    <w:p>
-      <w:pPr>
-        <w:pStyle w:val="ListParagraph"/>
-        <w:spacing w:line="360" w:lineRule="auto"/>
-        <w:ind w:left="567" w:firstLine="0"/>
-        <w:jc w:val="both"/>
-        <w:rPr>
-          <w:b/>
-          <w:bCs/>
-          <w:sz w:val="24"/>
-          <w:szCs w:val="24"/>
-        </w:rPr>
-      </w:pPr>
-      <w:r>
-        <w:rPr>
-          <w:b/>
-          <w:bCs/>
-          <w:sz w:val="24"/>
-          <w:szCs w:val="24"/>
-        </w:rPr>
-        <w:drawing>
-          <wp:inline distT="0" distB="0" distL="0" distR="0" wp14:anchorId="726F9D48" wp14:editId="500128DB">
-            <wp:extent cx="5769610" cy="530225"/>
-            <wp:effectExtent l="0" t="0" r="2540" b="3175"/>
-            <wp:docPr id="1135742939" name="Picture 1"/>
-            <wp:cNvGraphicFramePr>
-              <a:graphicFrameLocks xmlns:a="http://schemas.openxmlformats.org/drawingml/2006/main" noChangeAspect="1"/>
-            </wp:cNvGraphicFramePr>
-            <a:graphic xmlns:a="http://schemas.openxmlformats.org/drawingml/2006/main">
-              <a:graphicData uri="http://schemas.openxmlformats.org/drawingml/2006/picture">
-                <pic:pic xmlns:pic="http://schemas.openxmlformats.org/drawingml/2006/picture">
-                  <pic:nvPicPr>
-                    <pic:cNvPr id="1135742939" name=""/>
-                    <pic:cNvPicPr/>
-                  </pic:nvPicPr>
-                  <pic:blipFill>
-                    <a:blip r:embed="rId11"/>
-                    <a:stretch>
-                      <a:fillRect/>
-                    </a:stretch>
-                  </pic:blipFill>
-                  <pic:spPr>
-                    <a:xfrm>
-                      <a:off x="0" y="0"/>
-                      <a:ext cx="5769610" cy="530225"/>
-                    </a:xfrm>
-                    <a:prstGeom prst="rect">
-                      <a:avLst/>
-                    </a:prstGeom>
-                  </pic:spPr>
-                </pic:pic>
-              </a:graphicData>
-            </a:graphic>
-          </wp:inline>
-        </w:drawing>
-      </w:r>
-    </w:p>
+    <w:tbl>
+      <w:tblPr>
+        <w:tblW w:w="9000" w:type="dxa"/>
+        <w:tblInd w:w="667" w:type="dxa"/>
+        <w:tblLayout w:type="fixed"/>
+        <w:tblLook w:val="0600" w:firstRow="0" w:lastRow="0" w:firstColumn="0" w:lastColumn="0" w:noHBand="1" w:noVBand="1"/>
+      </w:tblPr>
+      <w:tblGrid>
+        <w:gridCol w:w="9000"/>
+      </w:tblGrid>
+      <w:tr>
+        <w:tc>
+          <w:tcPr>
+            <w:tcW w:w="9000" w:type="dxa"/>
+            <w:shd w:val="clear" w:color="auto" w:fill="282C34"/>
+            <w:tcMar>
+              <w:top w:w="100" w:type="dxa"/>
+              <w:left w:w="100" w:type="dxa"/>
+              <w:bottom w:w="100" w:type="dxa"/>
+              <w:right w:w="100" w:type="dxa"/>
+            </w:tcMar>
+          </w:tcPr>
+          <w:p>
+            <w:pPr>
+              <w:pBdr>
+                <w:top w:val="nil"/>
+                <w:left w:val="nil"/>
+                <w:bottom w:val="nil"/>
+                <w:right w:val="nil"/>
+                <w:between w:val="nil"/>
+              </w:pBdr>
+              <w:spacing w:line="360" w:lineRule="auto"/>
+              <w:rPr>
+                <w:rFonts w:ascii="Consolas" w:eastAsia="Consolas" w:hAnsi="Consolas" w:cs="Consolas"/>
+                <w:color w:val="D19A66"/>
+                <w:sz w:val="20"/>
+                <w:szCs w:val="20"/>
+                <w:shd w:val="clear" w:color="auto" w:fill="282C34"/>
+              </w:rPr>
+            </w:pPr>
+            <w:r>
+              <w:rPr>
+                <w:rFonts w:ascii="Consolas" w:eastAsia="Consolas" w:hAnsi="Consolas" w:cs="Consolas"/>
+                <w:color w:val="ABB2BF"/>
+                <w:sz w:val="20"/>
+                <w:szCs w:val="20"/>
+                <w:shd w:val="clear" w:color="auto" w:fill="282C34"/>
+              </w:rPr>
+              <w:t xml:space="preserve">Total_Bayar_Baht = Total_Bayar / </w:t>
+            </w:r>
+            <w:r>
+              <w:rPr>
+                <w:rFonts w:ascii="Consolas" w:eastAsia="Consolas" w:hAnsi="Consolas" w:cs="Consolas"/>
+                <w:color w:val="D19A66"/>
+                <w:sz w:val="20"/>
+                <w:szCs w:val="20"/>
+                <w:shd w:val="clear" w:color="auto" w:fill="282C34"/>
+              </w:rPr>
+              <w:t>533.8582</w:t>
+            </w:r>
+          </w:p>
+          <w:p>
+            <w:pPr>
+              <w:pBdr>
+                <w:top w:val="nil"/>
+                <w:left w:val="nil"/>
+                <w:bottom w:val="nil"/>
+                <w:right w:val="nil"/>
+                <w:between w:val="nil"/>
+              </w:pBdr>
+              <w:spacing w:line="360" w:lineRule="auto"/>
+              <w:rPr>
+                <w:rFonts w:ascii="Consolas" w:eastAsia="Consolas" w:hAnsi="Consolas" w:cs="Consolas"/>
+                <w:color w:val="BBBEBF"/>
+                <w:sz w:val="20"/>
+                <w:szCs w:val="20"/>
+              </w:rPr>
+            </w:pPr>
+            <w:r>
+              <w:rPr>
+                <w:rFonts w:ascii="Consolas" w:eastAsia="Consolas" w:hAnsi="Consolas" w:cs="Consolas"/>
+                <w:color w:val="ABB2BF"/>
+                <w:sz w:val="20"/>
+                <w:szCs w:val="20"/>
+                <w:shd w:val="clear" w:color="auto" w:fill="282C34"/>
+              </w:rPr>
+              <w:br/>
+              <w:t xml:space="preserve">Total_Bayar_Won = Total_Bayar / </w:t>
+            </w:r>
+            <w:r>
+              <w:rPr>
+                <w:rFonts w:ascii="Consolas" w:eastAsia="Consolas" w:hAnsi="Consolas" w:cs="Consolas"/>
+                <w:color w:val="D19A66"/>
+                <w:sz w:val="20"/>
+                <w:szCs w:val="20"/>
+                <w:shd w:val="clear" w:color="auto" w:fill="282C34"/>
+              </w:rPr>
+              <w:t>12.8243</w:t>
+            </w:r>
+          </w:p>
+        </w:tc>
+      </w:tr>
+    </w:tbl>
     <w:p>
       <w:pPr>
         <w:pStyle w:val="ListParagraph"/>
@@ -1572,6 +1743,149 @@
         <w:t>:</w:t>
       </w:r>
     </w:p>
+    <w:tbl>
+      <w:tblPr>
+        <w:tblW w:w="9015" w:type="dxa"/>
+        <w:tblInd w:w="667" w:type="dxa"/>
+        <w:tblLayout w:type="fixed"/>
+        <w:tblLook w:val="0600" w:firstRow="0" w:lastRow="0" w:firstColumn="0" w:lastColumn="0" w:noHBand="1" w:noVBand="1"/>
+      </w:tblPr>
+      <w:tblGrid>
+        <w:gridCol w:w="9015"/>
+      </w:tblGrid>
+      <w:tr>
+        <w:tc>
+          <w:tcPr>
+            <w:tcW w:w="9015" w:type="dxa"/>
+            <w:shd w:val="clear" w:color="auto" w:fill="282C34"/>
+            <w:tcMar>
+              <w:top w:w="100" w:type="dxa"/>
+              <w:left w:w="100" w:type="dxa"/>
+              <w:bottom w:w="100" w:type="dxa"/>
+              <w:right w:w="100" w:type="dxa"/>
+            </w:tcMar>
+          </w:tcPr>
+          <w:p>
+            <w:pPr>
+              <w:pBdr>
+                <w:top w:val="nil"/>
+                <w:left w:val="nil"/>
+                <w:bottom w:val="nil"/>
+                <w:right w:val="nil"/>
+                <w:between w:val="nil"/>
+              </w:pBdr>
+              <w:spacing w:line="360" w:lineRule="auto"/>
+              <w:rPr>
+                <w:rFonts w:ascii="Consolas" w:eastAsia="Consolas" w:hAnsi="Consolas" w:cs="Consolas"/>
+                <w:color w:val="BBBEBF"/>
+                <w:sz w:val="20"/>
+                <w:szCs w:val="20"/>
+              </w:rPr>
+            </w:pPr>
+            <w:r>
+              <w:rPr>
+                <w:rFonts w:ascii="Consolas" w:eastAsia="Consolas" w:hAnsi="Consolas" w:cs="Consolas"/>
+                <w:color w:val="C678DD"/>
+                <w:sz w:val="20"/>
+                <w:szCs w:val="20"/>
+                <w:shd w:val="clear" w:color="auto" w:fill="282C34"/>
+              </w:rPr>
+              <w:t>print</w:t>
+            </w:r>
+            <w:r>
+              <w:rPr>
+                <w:rFonts w:ascii="Consolas" w:eastAsia="Consolas" w:hAnsi="Consolas" w:cs="Consolas"/>
+                <w:color w:val="ABB2BF"/>
+                <w:sz w:val="20"/>
+                <w:szCs w:val="20"/>
+                <w:shd w:val="clear" w:color="auto" w:fill="282C34"/>
+              </w:rPr>
+              <w:t xml:space="preserve"> (</w:t>
+            </w:r>
+            <w:r>
+              <w:rPr>
+                <w:rFonts w:ascii="Consolas" w:eastAsia="Consolas" w:hAnsi="Consolas" w:cs="Consolas"/>
+                <w:color w:val="98C379"/>
+                <w:sz w:val="20"/>
+                <w:szCs w:val="20"/>
+                <w:shd w:val="clear" w:color="auto" w:fill="282C34"/>
+              </w:rPr>
+              <w:t>"Harga barang 1, Barang 3, dan Barang 5            : Rp"</w:t>
+            </w:r>
+            <w:r>
+              <w:rPr>
+                <w:rFonts w:ascii="Consolas" w:eastAsia="Consolas" w:hAnsi="Consolas" w:cs="Consolas"/>
+                <w:color w:val="ABB2BF"/>
+                <w:sz w:val="20"/>
+                <w:szCs w:val="20"/>
+                <w:shd w:val="clear" w:color="auto" w:fill="282C34"/>
+              </w:rPr>
+              <w:t>,Barang[</w:t>
+            </w:r>
+            <w:r>
+              <w:rPr>
+                <w:rFonts w:ascii="Consolas" w:eastAsia="Consolas" w:hAnsi="Consolas" w:cs="Consolas"/>
+                <w:color w:val="D19A66"/>
+                <w:sz w:val="20"/>
+                <w:szCs w:val="20"/>
+                <w:shd w:val="clear" w:color="auto" w:fill="282C34"/>
+              </w:rPr>
+              <w:t>0</w:t>
+            </w:r>
+            <w:r>
+              <w:rPr>
+                <w:rFonts w:ascii="Consolas" w:eastAsia="Consolas" w:hAnsi="Consolas" w:cs="Consolas"/>
+                <w:color w:val="ABB2BF"/>
+                <w:sz w:val="20"/>
+                <w:szCs w:val="20"/>
+                <w:shd w:val="clear" w:color="auto" w:fill="282C34"/>
+              </w:rPr>
+              <w:t>:</w:t>
+            </w:r>
+            <w:r>
+              <w:rPr>
+                <w:rFonts w:ascii="Consolas" w:eastAsia="Consolas" w:hAnsi="Consolas" w:cs="Consolas"/>
+                <w:color w:val="D19A66"/>
+                <w:sz w:val="20"/>
+                <w:szCs w:val="20"/>
+                <w:shd w:val="clear" w:color="auto" w:fill="282C34"/>
+              </w:rPr>
+              <w:t>5</w:t>
+            </w:r>
+            <w:r>
+              <w:rPr>
+                <w:rFonts w:ascii="Consolas" w:eastAsia="Consolas" w:hAnsi="Consolas" w:cs="Consolas"/>
+                <w:color w:val="ABB2BF"/>
+                <w:sz w:val="20"/>
+                <w:szCs w:val="20"/>
+                <w:shd w:val="clear" w:color="auto" w:fill="282C34"/>
+              </w:rPr>
+              <w:t>:</w:t>
+            </w:r>
+            <w:r>
+              <w:rPr>
+                <w:rFonts w:ascii="Consolas" w:eastAsia="Consolas" w:hAnsi="Consolas" w:cs="Consolas"/>
+                <w:color w:val="D19A66"/>
+                <w:sz w:val="20"/>
+                <w:szCs w:val="20"/>
+                <w:shd w:val="clear" w:color="auto" w:fill="282C34"/>
+              </w:rPr>
+              <w:t>2</w:t>
+            </w:r>
+            <w:r>
+              <w:rPr>
+                <w:rFonts w:ascii="Consolas" w:eastAsia="Consolas" w:hAnsi="Consolas" w:cs="Consolas"/>
+                <w:color w:val="ABB2BF"/>
+                <w:sz w:val="20"/>
+                <w:szCs w:val="20"/>
+                <w:shd w:val="clear" w:color="auto" w:fill="282C34"/>
+              </w:rPr>
+              <w:t>])</w:t>
+            </w:r>
+          </w:p>
+        </w:tc>
+      </w:tr>
+    </w:tbl>
     <w:p>
       <w:pPr>
         <w:pStyle w:val="ListParagraph"/>
@@ -1585,49 +1899,34 @@
           <w:szCs w:val="24"/>
         </w:rPr>
       </w:pPr>
-      <w:r>
+    </w:p>
+    <w:p>
+      <w:pPr>
+        <w:pStyle w:val="ListParagraph"/>
+        <w:spacing w:line="360" w:lineRule="auto"/>
+        <w:ind w:left="567" w:firstLine="0"/>
+        <w:jc w:val="both"/>
         <w:rPr>
           <w:b/>
           <w:bCs/>
           <w:sz w:val="24"/>
           <w:szCs w:val="24"/>
         </w:rPr>
-        <w:drawing>
-          <wp:inline distT="0" distB="0" distL="0" distR="0" wp14:anchorId="02F0908A" wp14:editId="5822A64B">
-            <wp:extent cx="5769610" cy="153035"/>
-            <wp:effectExtent l="0" t="0" r="2540" b="0"/>
-            <wp:docPr id="273300663" name="Picture 1"/>
-            <wp:cNvGraphicFramePr>
-              <a:graphicFrameLocks xmlns:a="http://schemas.openxmlformats.org/drawingml/2006/main" noChangeAspect="1"/>
-            </wp:cNvGraphicFramePr>
-            <a:graphic xmlns:a="http://schemas.openxmlformats.org/drawingml/2006/main">
-              <a:graphicData uri="http://schemas.openxmlformats.org/drawingml/2006/picture">
-                <pic:pic xmlns:pic="http://schemas.openxmlformats.org/drawingml/2006/picture">
-                  <pic:nvPicPr>
-                    <pic:cNvPr id="273300663" name=""/>
-                    <pic:cNvPicPr/>
-                  </pic:nvPicPr>
-                  <pic:blipFill>
-                    <a:blip r:embed="rId12"/>
-                    <a:stretch>
-                      <a:fillRect/>
-                    </a:stretch>
-                  </pic:blipFill>
-                  <pic:spPr>
-                    <a:xfrm>
-                      <a:off x="0" y="0"/>
-                      <a:ext cx="5769610" cy="153035"/>
-                    </a:xfrm>
-                    <a:prstGeom prst="rect">
-                      <a:avLst/>
-                    </a:prstGeom>
-                  </pic:spPr>
-                </pic:pic>
-              </a:graphicData>
-            </a:graphic>
-          </wp:inline>
-        </w:drawing>
-      </w:r>
+      </w:pPr>
+    </w:p>
+    <w:p>
+      <w:pPr>
+        <w:pStyle w:val="ListParagraph"/>
+        <w:spacing w:line="360" w:lineRule="auto"/>
+        <w:ind w:left="567" w:firstLine="0"/>
+        <w:jc w:val="both"/>
+        <w:rPr>
+          <w:b/>
+          <w:bCs/>
+          <w:sz w:val="24"/>
+          <w:szCs w:val="24"/>
+        </w:rPr>
+      </w:pPr>
     </w:p>
     <w:p>
       <w:pPr>
@@ -1708,60 +2007,184 @@
         <w:t>Source Code:</w:t>
       </w:r>
     </w:p>
-    <w:p>
-      <w:pPr>
-        <w:pStyle w:val="ListParagraph"/>
-        <w:spacing w:line="360" w:lineRule="auto"/>
-        <w:ind w:left="567" w:firstLine="0"/>
-        <w:jc w:val="both"/>
-        <w:rPr>
-          <w:sz w:val="24"/>
-          <w:szCs w:val="24"/>
-        </w:rPr>
-      </w:pPr>
-      <w:r>
-        <w:rPr>
-          <w:sz w:val="24"/>
-          <w:szCs w:val="24"/>
-        </w:rPr>
-        <w:lastRenderedPageBreak/>
-        <w:drawing>
-          <wp:inline distT="0" distB="0" distL="0" distR="0" wp14:anchorId="6CB217C8" wp14:editId="2F05EED6">
-            <wp:extent cx="5769610" cy="2045335"/>
-            <wp:effectExtent l="0" t="0" r="2540" b="0"/>
-            <wp:docPr id="221146128" name="Picture 1"/>
-            <wp:cNvGraphicFramePr>
-              <a:graphicFrameLocks xmlns:a="http://schemas.openxmlformats.org/drawingml/2006/main" noChangeAspect="1"/>
-            </wp:cNvGraphicFramePr>
-            <a:graphic xmlns:a="http://schemas.openxmlformats.org/drawingml/2006/main">
-              <a:graphicData uri="http://schemas.openxmlformats.org/drawingml/2006/picture">
-                <pic:pic xmlns:pic="http://schemas.openxmlformats.org/drawingml/2006/picture">
-                  <pic:nvPicPr>
-                    <pic:cNvPr id="221146128" name=""/>
-                    <pic:cNvPicPr/>
-                  </pic:nvPicPr>
-                  <pic:blipFill>
-                    <a:blip r:embed="rId13"/>
-                    <a:stretch>
-                      <a:fillRect/>
-                    </a:stretch>
-                  </pic:blipFill>
-                  <pic:spPr>
-                    <a:xfrm>
-                      <a:off x="0" y="0"/>
-                      <a:ext cx="5769610" cy="2045335"/>
-                    </a:xfrm>
-                    <a:prstGeom prst="rect">
-                      <a:avLst/>
-                    </a:prstGeom>
-                  </pic:spPr>
-                </pic:pic>
-              </a:graphicData>
-            </a:graphic>
-          </wp:inline>
-        </w:drawing>
-      </w:r>
-    </w:p>
+    <w:tbl>
+      <w:tblPr>
+        <w:tblW w:w="9000" w:type="dxa"/>
+        <w:tblInd w:w="667" w:type="dxa"/>
+        <w:tblLayout w:type="fixed"/>
+        <w:tblLook w:val="0600" w:firstRow="0" w:lastRow="0" w:firstColumn="0" w:lastColumn="0" w:noHBand="1" w:noVBand="1"/>
+      </w:tblPr>
+      <w:tblGrid>
+        <w:gridCol w:w="9000"/>
+      </w:tblGrid>
+      <w:tr>
+        <w:tc>
+          <w:tcPr>
+            <w:tcW w:w="9000" w:type="dxa"/>
+            <w:shd w:val="clear" w:color="auto" w:fill="282C34"/>
+            <w:tcMar>
+              <w:top w:w="100" w:type="dxa"/>
+              <w:left w:w="100" w:type="dxa"/>
+              <w:bottom w:w="100" w:type="dxa"/>
+              <w:right w:w="100" w:type="dxa"/>
+            </w:tcMar>
+          </w:tcPr>
+          <w:p>
+            <w:pPr>
+              <w:pBdr>
+                <w:top w:val="nil"/>
+                <w:left w:val="nil"/>
+                <w:bottom w:val="nil"/>
+                <w:right w:val="nil"/>
+                <w:between w:val="nil"/>
+              </w:pBdr>
+              <w:spacing w:line="360" w:lineRule="auto"/>
+              <w:rPr>
+                <w:rFonts w:ascii="Consolas" w:eastAsia="Consolas" w:hAnsi="Consolas" w:cs="Consolas"/>
+                <w:color w:val="C9D1D9"/>
+                <w:sz w:val="20"/>
+                <w:szCs w:val="20"/>
+              </w:rPr>
+            </w:pPr>
+            <w:r>
+              <w:rPr>
+                <w:rFonts w:ascii="Consolas" w:eastAsia="Consolas" w:hAnsi="Consolas" w:cs="Consolas"/>
+                <w:color w:val="ABB2BF"/>
+                <w:sz w:val="20"/>
+                <w:szCs w:val="20"/>
+                <w:shd w:val="clear" w:color="auto" w:fill="282C34"/>
+              </w:rPr>
+              <w:t>Barang = [Barang_1, Barang_2, Barang_3, Barang_4, Barang_5, Barang_6]</w:t>
+            </w:r>
+            <w:r>
+              <w:rPr>
+                <w:rFonts w:ascii="Consolas" w:eastAsia="Consolas" w:hAnsi="Consolas" w:cs="Consolas"/>
+                <w:color w:val="ABB2BF"/>
+                <w:sz w:val="20"/>
+                <w:szCs w:val="20"/>
+                <w:shd w:val="clear" w:color="auto" w:fill="282C34"/>
+              </w:rPr>
+              <w:br/>
+            </w:r>
+            <w:r>
+              <w:rPr>
+                <w:rFonts w:ascii="Consolas" w:eastAsia="Consolas" w:hAnsi="Consolas" w:cs="Consolas"/>
+                <w:color w:val="ABB2BF"/>
+                <w:sz w:val="20"/>
+                <w:szCs w:val="20"/>
+                <w:shd w:val="clear" w:color="auto" w:fill="282C34"/>
+              </w:rPr>
+              <w:br/>
+              <w:t>Total_Belanjaan = Barang_1 + Barang_2 + Barang_3 + Barang_4 + Barang_5 + Barang_6</w:t>
+            </w:r>
+            <w:r>
+              <w:rPr>
+                <w:rFonts w:ascii="Consolas" w:eastAsia="Consolas" w:hAnsi="Consolas" w:cs="Consolas"/>
+                <w:color w:val="ABB2BF"/>
+                <w:sz w:val="20"/>
+                <w:szCs w:val="20"/>
+                <w:shd w:val="clear" w:color="auto" w:fill="282C34"/>
+              </w:rPr>
+              <w:br/>
+            </w:r>
+            <w:r>
+              <w:rPr>
+                <w:rFonts w:ascii="Consolas" w:eastAsia="Consolas" w:hAnsi="Consolas" w:cs="Consolas"/>
+                <w:color w:val="ABB2BF"/>
+                <w:sz w:val="20"/>
+                <w:szCs w:val="20"/>
+                <w:shd w:val="clear" w:color="auto" w:fill="282C34"/>
+              </w:rPr>
+              <w:br/>
+              <w:t xml:space="preserve">Pajak = </w:t>
+            </w:r>
+            <w:r>
+              <w:rPr>
+                <w:rFonts w:ascii="Consolas" w:eastAsia="Consolas" w:hAnsi="Consolas" w:cs="Consolas"/>
+                <w:color w:val="D19A66"/>
+                <w:sz w:val="20"/>
+                <w:szCs w:val="20"/>
+                <w:shd w:val="clear" w:color="auto" w:fill="282C34"/>
+              </w:rPr>
+              <w:t>0.15</w:t>
+            </w:r>
+            <w:r>
+              <w:rPr>
+                <w:rFonts w:ascii="Consolas" w:eastAsia="Consolas" w:hAnsi="Consolas" w:cs="Consolas"/>
+                <w:color w:val="ABB2BF"/>
+                <w:sz w:val="20"/>
+                <w:szCs w:val="20"/>
+                <w:shd w:val="clear" w:color="auto" w:fill="282C34"/>
+              </w:rPr>
+              <w:t xml:space="preserve"> * Total_Belanjaan</w:t>
+            </w:r>
+            <w:r>
+              <w:rPr>
+                <w:rFonts w:ascii="Consolas" w:eastAsia="Consolas" w:hAnsi="Consolas" w:cs="Consolas"/>
+                <w:color w:val="ABB2BF"/>
+                <w:sz w:val="20"/>
+                <w:szCs w:val="20"/>
+                <w:shd w:val="clear" w:color="auto" w:fill="282C34"/>
+              </w:rPr>
+              <w:br/>
+            </w:r>
+            <w:r>
+              <w:rPr>
+                <w:rFonts w:ascii="Consolas" w:eastAsia="Consolas" w:hAnsi="Consolas" w:cs="Consolas"/>
+                <w:color w:val="ABB2BF"/>
+                <w:sz w:val="20"/>
+                <w:szCs w:val="20"/>
+                <w:shd w:val="clear" w:color="auto" w:fill="282C34"/>
+              </w:rPr>
+              <w:br/>
+              <w:t>Total_Bayar = Total_Belanjaan + Pajak</w:t>
+            </w:r>
+            <w:r>
+              <w:rPr>
+                <w:rFonts w:ascii="Consolas" w:eastAsia="Consolas" w:hAnsi="Consolas" w:cs="Consolas"/>
+                <w:color w:val="ABB2BF"/>
+                <w:sz w:val="20"/>
+                <w:szCs w:val="20"/>
+                <w:shd w:val="clear" w:color="auto" w:fill="282C34"/>
+              </w:rPr>
+              <w:br/>
+            </w:r>
+            <w:r>
+              <w:rPr>
+                <w:rFonts w:ascii="Consolas" w:eastAsia="Consolas" w:hAnsi="Consolas" w:cs="Consolas"/>
+                <w:color w:val="ABB2BF"/>
+                <w:sz w:val="20"/>
+                <w:szCs w:val="20"/>
+                <w:shd w:val="clear" w:color="auto" w:fill="282C34"/>
+              </w:rPr>
+              <w:br/>
+              <w:t>Rata_Rata = Total_Belanjaan / len(Barang)</w:t>
+            </w:r>
+            <w:r>
+              <w:rPr>
+                <w:rFonts w:ascii="Consolas" w:eastAsia="Consolas" w:hAnsi="Consolas" w:cs="Consolas"/>
+                <w:color w:val="ABB2BF"/>
+                <w:sz w:val="20"/>
+                <w:szCs w:val="20"/>
+                <w:shd w:val="clear" w:color="auto" w:fill="282C34"/>
+              </w:rPr>
+              <w:br/>
+            </w:r>
+            <w:r>
+              <w:rPr>
+                <w:rFonts w:ascii="Consolas" w:eastAsia="Consolas" w:hAnsi="Consolas" w:cs="Consolas"/>
+                <w:color w:val="ABB2BF"/>
+                <w:sz w:val="20"/>
+                <w:szCs w:val="20"/>
+                <w:shd w:val="clear" w:color="auto" w:fill="282C34"/>
+              </w:rPr>
+              <w:br/>
+              <w:t>Bolean = NIM &lt; Rata_Rata</w:t>
+            </w:r>
+          </w:p>
+        </w:tc>
+      </w:tr>
+    </w:tbl>
     <w:p>
       <w:pPr>
         <w:pStyle w:val="ListParagraph"/>
@@ -1827,7 +2250,7 @@
                     <pic:cNvPicPr/>
                   </pic:nvPicPr>
                   <pic:blipFill>
-                    <a:blip r:embed="rId14"/>
+                    <a:blip r:embed="rId9"/>
                     <a:stretch>
                       <a:fillRect/>
                     </a:stretch>
@@ -1847,6 +2270,36 @@
           </wp:inline>
         </w:drawing>
       </w:r>
+    </w:p>
+    <w:p>
+      <w:pPr>
+        <w:widowControl/>
+        <w:autoSpaceDE/>
+        <w:autoSpaceDN/>
+        <w:spacing w:line="360" w:lineRule="auto"/>
+        <w:jc w:val="center"/>
+        <w:rPr>
+          <w:sz w:val="24"/>
+          <w:szCs w:val="24"/>
+          <w:lang w:val="en-US"/>
+        </w:rPr>
+      </w:pPr>
+      <w:r>
+        <w:rPr>
+          <w:sz w:val="24"/>
+          <w:szCs w:val="24"/>
+          <w:lang w:val="en-US"/>
+        </w:rPr>
+        <w:t xml:space="preserve">Gambar </w:t>
+      </w:r>
+      <w:r>
+        <w:rPr>
+          <w:sz w:val="24"/>
+          <w:szCs w:val="24"/>
+          <w:lang w:val="en-US"/>
+        </w:rPr>
+        <w:t>4.1 Output</w:t>
+      </w:r>
       <w:r>
         <w:rPr>
           <w:rFonts w:ascii="Consolas" w:hAnsi="Consolas"/>
@@ -1909,6 +2362,72 @@
       </w:pPr>
       <w:r>
         <w:rPr>
+          <w:noProof/>
+          <w:sz w:val="24"/>
+          <w:szCs w:val="24"/>
+        </w:rPr>
+        <w:drawing>
+          <wp:inline distT="0" distB="0" distL="0" distR="0" wp14:anchorId="3A739B78" wp14:editId="002020EA">
+            <wp:extent cx="5226319" cy="234962"/>
+            <wp:effectExtent l="0" t="0" r="0" b="0"/>
+            <wp:docPr id="73762194" name="Picture 1"/>
+            <wp:cNvGraphicFramePr>
+              <a:graphicFrameLocks xmlns:a="http://schemas.openxmlformats.org/drawingml/2006/main" noChangeAspect="1"/>
+            </wp:cNvGraphicFramePr>
+            <a:graphic xmlns:a="http://schemas.openxmlformats.org/drawingml/2006/main">
+              <a:graphicData uri="http://schemas.openxmlformats.org/drawingml/2006/picture">
+                <pic:pic xmlns:pic="http://schemas.openxmlformats.org/drawingml/2006/picture">
+                  <pic:nvPicPr>
+                    <pic:cNvPr id="73762194" name=""/>
+                    <pic:cNvPicPr/>
+                  </pic:nvPicPr>
+                  <pic:blipFill>
+                    <a:blip r:embed="rId10"/>
+                    <a:stretch>
+                      <a:fillRect/>
+                    </a:stretch>
+                  </pic:blipFill>
+                  <pic:spPr>
+                    <a:xfrm>
+                      <a:off x="0" y="0"/>
+                      <a:ext cx="5226319" cy="234962"/>
+                    </a:xfrm>
+                    <a:prstGeom prst="rect">
+                      <a:avLst/>
+                    </a:prstGeom>
+                  </pic:spPr>
+                </pic:pic>
+              </a:graphicData>
+            </a:graphic>
+          </wp:inline>
+        </w:drawing>
+      </w:r>
+    </w:p>
+    <w:p>
+      <w:pPr>
+        <w:pStyle w:val="ListParagraph"/>
+        <w:spacing w:line="360" w:lineRule="auto"/>
+        <w:ind w:left="567" w:firstLine="0"/>
+        <w:jc w:val="both"/>
+        <w:rPr>
+          <w:sz w:val="24"/>
+          <w:szCs w:val="24"/>
+        </w:rPr>
+      </w:pPr>
+    </w:p>
+    <w:p>
+      <w:pPr>
+        <w:pStyle w:val="ListParagraph"/>
+        <w:spacing w:line="360" w:lineRule="auto"/>
+        <w:ind w:left="567" w:firstLine="0"/>
+        <w:jc w:val="both"/>
+        <w:rPr>
+          <w:sz w:val="24"/>
+          <w:szCs w:val="24"/>
+        </w:rPr>
+      </w:pPr>
+      <w:r>
+        <w:rPr>
           <w:sz w:val="24"/>
           <w:szCs w:val="24"/>
         </w:rPr>
@@ -1972,6 +2491,60 @@
       </w:pPr>
       <w:r>
         <w:rPr>
+          <w:noProof/>
+          <w:sz w:val="24"/>
+          <w:szCs w:val="24"/>
+        </w:rPr>
+        <w:drawing>
+          <wp:inline distT="0" distB="0" distL="0" distR="0" wp14:anchorId="7C76DB09" wp14:editId="20D9CE93">
+            <wp:extent cx="5769610" cy="473075"/>
+            <wp:effectExtent l="0" t="0" r="2540" b="3175"/>
+            <wp:docPr id="1759194101" name="Picture 1"/>
+            <wp:cNvGraphicFramePr>
+              <a:graphicFrameLocks xmlns:a="http://schemas.openxmlformats.org/drawingml/2006/main" noChangeAspect="1"/>
+            </wp:cNvGraphicFramePr>
+            <a:graphic xmlns:a="http://schemas.openxmlformats.org/drawingml/2006/main">
+              <a:graphicData uri="http://schemas.openxmlformats.org/drawingml/2006/picture">
+                <pic:pic xmlns:pic="http://schemas.openxmlformats.org/drawingml/2006/picture">
+                  <pic:nvPicPr>
+                    <pic:cNvPr id="1759194101" name=""/>
+                    <pic:cNvPicPr/>
+                  </pic:nvPicPr>
+                  <pic:blipFill>
+                    <a:blip r:embed="rId11"/>
+                    <a:stretch>
+                      <a:fillRect/>
+                    </a:stretch>
+                  </pic:blipFill>
+                  <pic:spPr>
+                    <a:xfrm>
+                      <a:off x="0" y="0"/>
+                      <a:ext cx="5769610" cy="473075"/>
+                    </a:xfrm>
+                    <a:prstGeom prst="rect">
+                      <a:avLst/>
+                    </a:prstGeom>
+                  </pic:spPr>
+                </pic:pic>
+              </a:graphicData>
+            </a:graphic>
+          </wp:inline>
+        </w:drawing>
+      </w:r>
+    </w:p>
+    <w:p>
+      <w:pPr>
+        <w:pStyle w:val="ListParagraph"/>
+        <w:spacing w:line="360" w:lineRule="auto"/>
+        <w:ind w:left="567" w:firstLine="0"/>
+        <w:jc w:val="both"/>
+        <w:rPr>
+          <w:sz w:val="24"/>
+          <w:szCs w:val="24"/>
+        </w:rPr>
+      </w:pPr>
+      <w:r>
+        <w:rPr>
           <w:sz w:val="24"/>
           <w:szCs w:val="24"/>
         </w:rPr>
@@ -2017,15 +2590,7 @@
           <w:sz w:val="24"/>
           <w:szCs w:val="24"/>
         </w:rPr>
-        <w:t xml:space="preserve">langkah terakhir ini mengirimkan seluruh perubahan yang sudah di-commit agar </w:t>
-      </w:r>
-      <w:r>
-        <w:rPr>
-          <w:sz w:val="24"/>
-          <w:szCs w:val="24"/>
-        </w:rPr>
-        <w:lastRenderedPageBreak/>
-        <w:t xml:space="preserve">tersimpan </w:t>
+        <w:t xml:space="preserve">langkah terakhir ini mengirimkan seluruh perubahan yang sudah di-commit agar tersimpan </w:t>
       </w:r>
       <w:r>
         <w:rPr>
@@ -2048,7 +2613,7 @@
       </w:pPr>
     </w:p>
     <w:sectPr>
-      <w:footerReference w:type="default" r:id="rId15"/>
+      <w:footerReference w:type="default" r:id="rId12"/>
       <w:pgSz w:w="11920" w:h="16840"/>
       <w:pgMar w:top="1380" w:right="1417" w:bottom="980" w:left="1417" w:header="0" w:footer="785" w:gutter="0"/>
       <w:cols w:space="720"/>

</xml_diff>